<commit_message>
6d R14: izdanje 0.3.0~rc2 (pravilo 49) — oba paketa, vodiči, slike iz paketa, vodič za živi test
- VERSION 0.3.0~rc2; paketi pse-riemann-andrej i pse-riemann (javni) izgrađeni, selftest iz OBA
  raspakovana paketa (sistemski python3, privremeni HOME/vault): SVE PROLAZI; GUI javnog paketa provjeren
- „⋯“ (prevod) u svom desnom žlijebu MarkdownView-a — više ne prekriva tekst
- tab Misije: prazno stanje (0 od 0 radova, dugmad misije ugašena bez misije)
- VODIC-SR / GUIDE-EN: radni prostor misije, razgovor na klik, „Zadaj da čita…“, pamćenje misije,
  glas (linkovi misija, pitanje koje traži sud, SQL ponovni pokušaj); nove slike iz paketa (03b) + docx
- vodič za živi test rc2 (SR + EN, docx) — 16 koraka
- WORKLOG, ZA-ANDREJA (push, živi test, tumačenja treće runde, jedna moja greška), plan + docx
- pytest 369/369; PSE revizija i revizija jezika čiste

Co-Authored-By: Claude Opus 5.5 <noreply@anthropic.com>
</commit_message>
<xml_diff>
--- a/GUIDE-EN.docx
+++ b/GUIDE-EN.docx
@@ -217,7 +217,7 @@
           <w:sz w:val="20"/>
           <w:szCs w:val="20"/>
         </w:rPr>
-        <w:t xml:space="preserve">sudo apt install ./pse-riemann_0.3.0~rc1_amd64.deb</w:t>
+        <w:t xml:space="preserve">sudo apt install ./pse-riemann_0.3.0~rc2_amd64.deb</w:t>
       </w:r>
     </w:p>
     <w:p>
@@ -819,7 +819,7 @@
         <w:t xml:space="preserve">Missions</w:t>
       </w:r>
       <w:r>
-        <w:t xml:space="preserve"> — standing research questions. For each: the question, the state, the frontier (lowest B), the goal, the step log (state → action → outcome). Buttons:</w:t>
+        <w:t xml:space="preserve"> — the missions' workspace:</w:t>
       </w:r>
     </w:p>
     <w:p>
@@ -833,13 +833,23 @@
       </w:pPr>
       <w:r>
         <w:rPr>
+          <w:b/>
+          <w:bCs/>
+        </w:rPr>
+        <w:t xml:space="preserve">on the left</w:t>
+      </w:r>
+      <w:r>
+        <w:t xml:space="preserve"> the missions as cards (title, short state, frontier, number of papers, how many items await you) and </w:t>
+      </w:r>
+      <w:r>
+        <w:rPr>
           <w:i/>
           <w:iCs/>
         </w:rPr>
-        <w:t xml:space="preserve">New mission…</w:t>
-      </w:r>
-      <w:r>
-        <w:t xml:space="preserve"> — a title + a question; the mission starts as "open";</w:t>
+        <w:t xml:space="preserve">+ New mission</w:t>
+      </w:r>
+      <w:r>
+        <w:t xml:space="preserve">; ▶ = active, ⏸ = saved for later;</w:t>
       </w:r>
     </w:p>
     <w:p>
@@ -853,13 +863,13 @@
       </w:pPr>
       <w:r>
         <w:rPr>
-          <w:i/>
-          <w:iCs/>
-        </w:rPr>
-        <w:t xml:space="preserve">Talk about the mission</w:t>
-      </w:r>
-      <w:r>
-        <w:t xml:space="preserve"> — a conversation with the mission agent (§6);</w:t>
+          <w:b/>
+          <w:bCs/>
+        </w:rPr>
+        <w:t xml:space="preserve">a click on a mission</w:t>
+      </w:r>
+      <w:r>
+        <w:t xml:space="preserve"> opens its workspace and starts the mission agent at once (§6);</w:t>
       </w:r>
     </w:p>
     <w:p>
@@ -873,10 +883,40 @@
       </w:pPr>
       <w:r>
         <w:rPr>
+          <w:b/>
+          <w:bCs/>
+        </w:rPr>
+        <w:t xml:space="preserve">upper right:</w:t>
+      </w:r>
+      <w:r>
+        <w:t xml:space="preserve"> the chosen mission's details (question, state, goal, frontier, last steps) and your </w:t>
+      </w:r>
+      <w:r>
+        <w:rPr>
+          <w:b/>
+          <w:bCs/>
+        </w:rPr>
+        <w:t xml:space="preserve">"Where you left off"</w:t>
+      </w:r>
+      <w:r>
+        <w:t xml:space="preserve"> note, and beside them the </w:t>
+      </w:r>
+      <w:r>
+        <w:rPr>
+          <w:b/>
+          <w:bCs/>
+        </w:rPr>
+        <w:t xml:space="preserve">mission memory</w:t>
+      </w:r>
+      <w:r>
+        <w:t xml:space="preserve"> (§6); buttons </w:t>
+      </w:r>
+      <w:r>
+        <w:rPr>
           <w:i/>
           <w:iCs/>
         </w:rPr>
-        <w:t xml:space="preserve">Switch to selected</w:t>
+        <w:t xml:space="preserve">Activate</w:t>
       </w:r>
       <w:r>
         <w:t xml:space="preserve">, </w:t>
@@ -886,30 +926,30 @@
           <w:i/>
           <w:iCs/>
         </w:rPr>
-        <w:t xml:space="preserve">Next mission ⟳</w:t>
-      </w:r>
-      <w:r>
-        <w:t xml:space="preserve">, </w:t>
+        <w:t xml:space="preserve">Save for later…</w:t>
+      </w:r>
+      <w:r>
+        <w:t xml:space="preserve"> (a "where you left off" note + an automatic snapshot), </w:t>
       </w:r>
       <w:r>
         <w:rPr>
           <w:i/>
           <w:iCs/>
         </w:rPr>
-        <w:t xml:space="preserve">Leave for later…</w:t>
-      </w:r>
-      <w:r>
-        <w:t xml:space="preserve"> (a "where you left off" note + an automatic snapshot), </w:t>
+        <w:t xml:space="preserve">Close the mission…</w:t>
+      </w:r>
+      <w:r>
+        <w:t xml:space="preserve"> (the mission agent dies, everything in it goes to SHARED_LIB) and </w:t>
       </w:r>
       <w:r>
         <w:rPr>
           <w:i/>
           <w:iCs/>
         </w:rPr>
-        <w:t xml:space="preserve">While waiting</w:t>
-      </w:r>
-      <w:r>
-        <w:t xml:space="preserve"> (fully frozen or quietly collecting);</w:t>
+        <w:t xml:space="preserve">Goal and background ▾</w:t>
+      </w:r>
+      <w:r>
+        <w:t xml:space="preserve"> (only you change the goal; "while it waits": fully frozen or quietly collecting);</w:t>
       </w:r>
     </w:p>
     <w:p>
@@ -923,13 +963,13 @@
       </w:pPr>
       <w:r>
         <w:rPr>
-          <w:i/>
-          <w:iCs/>
-        </w:rPr>
-        <w:t xml:space="preserve">Mission goal</w:t>
-      </w:r>
-      <w:r>
-        <w:t xml:space="preserve"> — only you change it; the app can only propose;</w:t>
+          <w:b/>
+          <w:bCs/>
+        </w:rPr>
+        <w:t xml:space="preserve">lower right:</w:t>
+      </w:r>
+      <w:r>
+        <w:t xml:space="preserve"> the paper strip and the conversation with the agent; drag the border between the upper and lower part with the mouse;</w:t>
       </w:r>
     </w:p>
     <w:p>
@@ -943,30 +983,30 @@
       </w:pPr>
       <w:r>
         <w:rPr>
+          <w:b/>
+          <w:bCs/>
+        </w:rPr>
+        <w:t xml:space="preserve">at the top of the tab</w:t>
+      </w:r>
+      <w:r>
+        <w:t xml:space="preserve"> is what holds for all missions: </w:t>
+      </w:r>
+      <w:r>
+        <w:rPr>
           <w:i/>
           <w:iCs/>
         </w:rPr>
-        <w:t xml:space="preserve">Close the mission…</w:t>
-      </w:r>
-      <w:r>
-        <w:t xml:space="preserve"> — the mission agent dies, everything in it goes to SHARED_LIB;</w:t>
-      </w:r>
-    </w:p>
-    <w:p>
-      <w:pPr>
-        <w:pStyle w:val="ListParagraph"/>
-        <w:numPr>
-          <w:ilvl w:val="0"/>
-          <w:numId w:val="2"/>
-        </w:numPr>
-        <w:spacing w:after="60"/>
-      </w:pPr>
+        <w:t xml:space="preserve">Check arXiv now</w:t>
+      </w:r>
+      <w:r>
+        <w:t xml:space="preserve">, </w:t>
+      </w:r>
       <w:r>
         <w:rPr>
           <w:i/>
           <w:iCs/>
         </w:rPr>
-        <w:t xml:space="preserve">Check arXiv now</w:t>
+        <w:t xml:space="preserve">Adversarial mode…</w:t>
       </w:r>
       <w:r>
         <w:t xml:space="preserve">, </w:t>
@@ -976,7 +1016,7 @@
           <w:i/>
           <w:iCs/>
         </w:rPr>
-        <w:t xml:space="preserve">Export mission report</w:t>
+        <w:t xml:space="preserve">Working paper…</w:t>
       </w:r>
       <w:r>
         <w:t xml:space="preserve">, </w:t>
@@ -986,17 +1026,7 @@
           <w:i/>
           <w:iCs/>
         </w:rPr>
-        <w:t xml:space="preserve">Adversarial mode…</w:t>
-      </w:r>
-      <w:r>
-        <w:t xml:space="preserve">, </w:t>
-      </w:r>
-      <w:r>
-        <w:rPr>
-          <w:i/>
-          <w:iCs/>
-        </w:rPr>
-        <w:t xml:space="preserve">Working paper…</w:t>
+        <w:t xml:space="preserve">Export mission report</w:t>
       </w:r>
       <w:r>
         <w:t xml:space="preserve">.</w:t>
@@ -1666,7 +1696,7 @@
         <w:pStyle w:val="Heading1"/>
       </w:pPr>
       <w:r>
-        <w:t xml:space="preserve">6. Talking about a mission (the mission agent)</w:t>
+        <w:t xml:space="preserve">6. Talking about a mission (the mission agent) and the mission memory</w:t>
       </w:r>
     </w:p>
     <w:p>
@@ -1675,17 +1705,95 @@
         <w:ind w:left="0"/>
       </w:pPr>
       <w:r>
-        <w:t xml:space="preserve">In the Missions tab: </w:t>
+        <w:rPr>
+          <w:b/>
+          <w:bCs/>
+        </w:rPr>
+        <w:t xml:space="preserve">A click on a mission</w:t>
+      </w:r>
+      <w:r>
+        <w:t xml:space="preserve"> in the Missions tab starts the mission agent: it reads the mission's state, </w:t>
+      </w:r>
+      <w:r>
+        <w:rPr>
+          <w:b/>
+          <w:bCs/>
+        </w:rPr>
+        <w:t xml:space="preserve">the memory of the last session</w:t>
+      </w:r>
+      <w:r>
+        <w:t xml:space="preserve">, your "where you left off" note and the papers, writes the first message (what it sees, where you stopped, at most 3 questions) and waits for you. The first model call costs.</w:t>
+      </w:r>
+    </w:p>
+    <w:p>
+      <w:pPr>
+        <w:spacing w:after="100"/>
+        <w:ind w:left="0"/>
+      </w:pPr>
+      <w:r>
+        <w:rPr>
+          <w:b/>
+          <w:bCs/>
+        </w:rPr>
+        <w:t xml:space="preserve">Which papers it reads:</w:t>
+      </w:r>
+      <w:r>
+        <w:t xml:space="preserve"> the first time all of the mission's papers (abstracts). After that the papers you chose last time plus the papers that arrived since — those are marked </w:t>
+      </w:r>
+      <w:r>
+        <w:rPr>
+          <w:b/>
+          <w:bCs/>
+        </w:rPr>
+        <w:t xml:space="preserve">🆕 new</w:t>
+      </w:r>
+      <w:r>
+        <w:t xml:space="preserve"> in the strip. The strip </w:t>
       </w:r>
       <w:r>
         <w:rPr>
           <w:i/>
           <w:iCs/>
         </w:rPr>
-        <w:t xml:space="preserve">Talk about the mission</w:t>
-      </w:r>
-      <w:r>
-        <w:t xml:space="preserve"> →</w:t>
+        <w:t xml:space="preserve">"N of M papers chosen ▾"</w:t>
+      </w:r>
+      <w:r>
+        <w:t xml:space="preserve"> folds open; tick or untick, and the agent reads the new choice from its next move.</w:t>
+      </w:r>
+    </w:p>
+    <w:p>
+      <w:pPr>
+        <w:spacing w:after="100"/>
+        <w:ind w:left="0"/>
+      </w:pPr>
+      <w:r>
+        <w:rPr>
+          <w:b/>
+          <w:bCs/>
+        </w:rPr>
+        <w:t xml:space="preserve">Give it to read…</w:t>
+      </w:r>
+      <w:r>
+        <w:t xml:space="preserve"> — hand the agent more reading: a paper from the list, </w:t>
+      </w:r>
+      <w:r>
+        <w:rPr>
+          <w:b/>
+          <w:bCs/>
+        </w:rPr>
+        <w:t xml:space="preserve">the full text of an arXiv paper</w:t>
+      </w:r>
+      <w:r>
+        <w:t xml:space="preserve"> (arXiv only, only when you ask), a card, a report or your own note.</w:t>
+      </w:r>
+    </w:p>
+    <w:p>
+      <w:pPr>
+        <w:spacing w:after="100"/>
+        <w:ind w:left="0"/>
+      </w:pPr>
+      <w:r>
+        <w:t xml:space="preserve">In the conversation:</w:t>
       </w:r>
     </w:p>
     <w:p>
@@ -1705,17 +1813,17 @@
         <w:t xml:space="preserve">1.	</w:t>
       </w:r>
       <w:r>
-        <w:t xml:space="preserve">choose the mission's papers (one, several or all — </w:t>
+        <w:t xml:space="preserve">you write and </w:t>
       </w:r>
       <w:r>
         <w:rPr>
           <w:i/>
           <w:iCs/>
         </w:rPr>
-        <w:t xml:space="preserve">Select all</w:t>
-      </w:r>
-      <w:r>
-        <w:t xml:space="preserve">);</w:t>
+        <w:t xml:space="preserve">Send</w:t>
+      </w:r>
+      <w:r>
+        <w:t xml:space="preserve">; the agent answers with a source (a paper's [ref] or a mission step), at most 3 questions per reply;</w:t>
       </w:r>
     </w:p>
     <w:p>
@@ -1736,13 +1844,13 @@
       </w:r>
       <w:r>
         <w:rPr>
-          <w:i/>
-          <w:iCs/>
-        </w:rPr>
-        <w:t xml:space="preserve">Start the conversation</w:t>
-      </w:r>
-      <w:r>
-        <w:t xml:space="preserve"> — the agent reads the abstracts and the state of the mission, says what it sees and asks you (at most 3 questions per reply);</w:t>
+          <w:b/>
+          <w:bCs/>
+        </w:rPr>
+        <w:t xml:space="preserve">the skeptic attacks every reply that contains a claim</w:t>
+      </w:r>
+      <w:r>
+        <w:t xml:space="preserve"> (a number, "holds", "follows");</w:t>
       </w:r>
     </w:p>
     <w:p>
@@ -1760,63 +1868,6 @@
           <w:color w:val="B07A1E"/>
         </w:rPr>
         <w:t xml:space="preserve">3.	</w:t>
-      </w:r>
-      <w:r>
-        <w:t xml:space="preserve">you talk both ways; </w:t>
-      </w:r>
-      <w:r>
-        <w:rPr>
-          <w:b/>
-          <w:bCs/>
-        </w:rPr>
-        <w:t xml:space="preserve">the skeptic attacks every reply that contains a claim</w:t>
-      </w:r>
-      <w:r>
-        <w:t xml:space="preserve"> (a number, "holds", "follows");</w:t>
-      </w:r>
-    </w:p>
-    <w:p>
-      <w:pPr>
-        <w:tabs>
-          <w:tab w:val="left" w:pos="460"/>
-        </w:tabs>
-        <w:spacing w:after="80"/>
-        <w:ind w:left="460" w:hanging="460"/>
-      </w:pPr>
-      <w:r>
-        <w:rPr>
-          <w:b/>
-          <w:bCs/>
-          <w:color w:val="B07A1E"/>
-        </w:rPr>
-        <w:t xml:space="preserve">4.	</w:t>
-      </w:r>
-      <w:r>
-        <w:rPr>
-          <w:i/>
-          <w:iCs/>
-        </w:rPr>
-        <w:t xml:space="preserve">Full text (arXiv)…</w:t>
-      </w:r>
-      <w:r>
-        <w:t xml:space="preserve"> — the full text only for arXiv papers and only when you ask; for the others the agent reads the abstract and says so;</w:t>
-      </w:r>
-    </w:p>
-    <w:p>
-      <w:pPr>
-        <w:tabs>
-          <w:tab w:val="left" w:pos="460"/>
-        </w:tabs>
-        <w:spacing w:after="80"/>
-        <w:ind w:left="460" w:hanging="460"/>
-      </w:pPr>
-      <w:r>
-        <w:rPr>
-          <w:b/>
-          <w:bCs/>
-          <w:color w:val="B07A1E"/>
-        </w:rPr>
-        <w:t xml:space="preserve">5.	</w:t>
       </w:r>
       <w:r>
         <w:rPr>
@@ -1898,7 +1949,7 @@
           <w:sz w:val="18"/>
           <w:szCs w:val="18"/>
         </w:rPr>
-        <w:t xml:space="preserve">Talking about a mission</w:t>
+        <w:t xml:space="preserve">The mission workspace: cards on the left, details and memory above, the conversation below</w:t>
       </w:r>
     </w:p>
     <w:p>
@@ -1907,43 +1958,24 @@
         <w:ind w:left="0"/>
       </w:pPr>
       <w:r>
-        <w:t xml:space="preserve">The conversation is saved in the results (</w:t>
-      </w:r>
-      <w:r>
-        <w:rPr>
-          <w:rFonts w:ascii="Consolas" w:cs="Consolas" w:eastAsia="Consolas" w:hAnsi="Consolas"/>
-          <w:color w:val="6B4A12"/>
-        </w:rPr>
-        <w:t xml:space="preserve">razgovori-o-misiji/</w:t>
-      </w:r>
-      <w:r>
-        <w:t xml:space="preserve">, label NAŠE-NERECENZIRANO / OURS-UNREVIEWED) and appears in "Where you left off". Every mission has its own agent (a PSE unit with an open lifespan); closing the mission ends it. </w:t>
-      </w:r>
-      <w:r>
-        <w:rPr>
-          <w:b/>
-          <w:bCs/>
-        </w:rPr>
-        <w:t xml:space="preserve">Without AI the mission agent does not work</w:t>
-      </w:r>
-      <w:r>
-        <w:t xml:space="preserve"> and says so.</w:t>
-      </w:r>
-    </w:p>
-    <w:p>
-      <w:pPr>
-        <w:pBdr>
-          <w:bottom w:val="single" w:color="B07A1E" w:sz="6" w:space="1"/>
-        </w:pBdr>
-        <w:spacing w:after="160"/>
-      </w:pPr>
-    </w:p>
-    <w:p>
-      <w:pPr>
-        <w:pStyle w:val="Heading1"/>
-      </w:pPr>
-      <w:r>
-        <w:t xml:space="preserve">7. Chat and the SHARED_LIB voice</w:t>
+        <w:rPr>
+          <w:b/>
+          <w:bCs/>
+        </w:rPr>
+        <w:t xml:space="preserve">The mission memory.</w:t>
+      </w:r>
+      <w:r>
+        <w:t xml:space="preserve"> The next session does not get the old conversation, </w:t>
+      </w:r>
+      <w:r>
+        <w:rPr>
+          <w:b/>
+          <w:bCs/>
+        </w:rPr>
+        <w:t xml:space="preserve">only what matters</w:t>
+      </w:r>
+      <w:r>
+        <w:t xml:space="preserve">: what was decided or agreed, what was established (always with a source), open questions and the agreed next step.</w:t>
       </w:r>
     </w:p>
     <w:p>
@@ -1956,44 +1988,93 @@
         <w:spacing w:after="60"/>
       </w:pPr>
       <w:r>
-        <w:rPr>
-          <w:b/>
-          <w:bCs/>
-        </w:rPr>
-        <w:t xml:space="preserve">"SHARED_LIB (facts)"</w:t>
-      </w:r>
-      <w:r>
-        <w:t xml:space="preserve"> (default): your question → </w:t>
-      </w:r>
-      <w:r>
-        <w:rPr>
-          <w:b/>
-          <w:bCs/>
-        </w:rPr>
-        <w:t xml:space="preserve">one read-only SELECT</w:t>
-      </w:r>
-      <w:r>
-        <w:t xml:space="preserve"> over the library → an answer in sentences, like a colleague at work, with </w:t>
-      </w:r>
-      <w:r>
-        <w:rPr>
-          <w:rFonts w:ascii="Consolas" w:cs="Consolas" w:eastAsia="Consolas" w:hAnsi="Consolas"/>
-          <w:color w:val="6B4A12"/>
-        </w:rPr>
-        <w:t xml:space="preserve">[id]</w:t>
-      </w:r>
-      <w:r>
-        <w:t xml:space="preserve"> citations. Below it is </w:t>
-      </w:r>
-      <w:r>
-        <w:rPr>
-          <w:b/>
-          <w:bCs/>
-        </w:rPr>
-        <w:t xml:space="preserve">▸ show where from</w:t>
-      </w:r>
-      <w:r>
-        <w:t xml:space="preserve"> — the exact SQL and the rows. When the data is not there: "That is not in the library (UNKNOWN)", never a guess. You can also type SQL directly. Without a model it works for known questions (missions, methods, cards, lab, awaiting) with template sentences.</w:t>
+        <w:t xml:space="preserve">The agent </w:t>
+      </w:r>
+      <w:r>
+        <w:rPr>
+          <w:b/>
+          <w:bCs/>
+        </w:rPr>
+        <w:t xml:space="preserve">proposes</w:t>
+      </w:r>
+      <w:r>
+        <w:t xml:space="preserve"> the memory at the end of a session: when you click </w:t>
+      </w:r>
+      <w:r>
+        <w:rPr>
+          <w:i/>
+          <w:iCs/>
+        </w:rPr>
+        <w:t xml:space="preserve">End the conversation</w:t>
+      </w:r>
+      <w:r>
+        <w:t xml:space="preserve">, when you switch to another mission, or when you close the app.</w:t>
+      </w:r>
+    </w:p>
+    <w:p>
+      <w:pPr>
+        <w:pStyle w:val="ListParagraph"/>
+        <w:numPr>
+          <w:ilvl w:val="0"/>
+          <w:numId w:val="2"/>
+        </w:numPr>
+        <w:spacing w:after="60"/>
+      </w:pPr>
+      <w:r>
+        <w:t xml:space="preserve">The proposal is saved at once, marked </w:t>
+      </w:r>
+      <w:r>
+        <w:rPr>
+          <w:b/>
+          <w:bCs/>
+        </w:rPr>
+        <w:t xml:space="preserve">"unreviewed"</w:t>
+      </w:r>
+      <w:r>
+        <w:t xml:space="preserve">, so it stands even if you never decide.</w:t>
+      </w:r>
+    </w:p>
+    <w:p>
+      <w:pPr>
+        <w:pStyle w:val="ListParagraph"/>
+        <w:numPr>
+          <w:ilvl w:val="0"/>
+          <w:numId w:val="2"/>
+        </w:numPr>
+        <w:spacing w:after="60"/>
+      </w:pPr>
+      <w:r>
+        <w:t xml:space="preserve">You review it upper right: tick what stays, double-click to correct the text, </w:t>
+      </w:r>
+      <w:r>
+        <w:rPr>
+          <w:i/>
+          <w:iCs/>
+        </w:rPr>
+        <w:t xml:space="preserve">Add</w:t>
+      </w:r>
+      <w:r>
+        <w:t xml:space="preserve"> or </w:t>
+      </w:r>
+      <w:r>
+        <w:rPr>
+          <w:i/>
+          <w:iCs/>
+        </w:rPr>
+        <w:t xml:space="preserve">Delete</w:t>
+      </w:r>
+      <w:r>
+        <w:t xml:space="preserve"> an item, then </w:t>
+      </w:r>
+      <w:r>
+        <w:rPr>
+          <w:b/>
+          <w:bCs/>
+        </w:rPr>
+        <w:t xml:space="preserve">Save the memory</w:t>
+      </w:r>
+      <w:r>
+        <w:t xml:space="preserve">.</w:t>
       </w:r>
     </w:p>
     <w:p>
@@ -2055,7 +2136,52 @@
           <w:sz w:val="18"/>
           <w:szCs w:val="18"/>
         </w:rPr>
-        <w:t xml:space="preserve">The SHARED_LIB voice: sentences, with "show where from" below</w:t>
+        <w:t xml:space="preserve">The mission memory: the agent's proposal, you review and save it</w:t>
+      </w:r>
+    </w:p>
+    <w:p>
+      <w:pPr>
+        <w:spacing w:after="100"/>
+        <w:ind w:left="0"/>
+      </w:pPr>
+      <w:r>
+        <w:t xml:space="preserve">The whole conversation is still saved in the results (</w:t>
+      </w:r>
+      <w:r>
+        <w:rPr>
+          <w:rFonts w:ascii="Consolas" w:cs="Consolas" w:eastAsia="Consolas" w:hAnsi="Consolas"/>
+          <w:color w:val="6B4A12"/>
+        </w:rPr>
+        <w:t xml:space="preserve">razgovori-o-misiji/</w:t>
+      </w:r>
+      <w:r>
+        <w:t xml:space="preserve">, label NAŠE-NERECENZIRANO / OURS-UNREVIEWED), but the agent no longer reads it. Every mission has its own agent (a PSE unit with an open lifespan); closing the mission ends it. </w:t>
+      </w:r>
+      <w:r>
+        <w:rPr>
+          <w:b/>
+          <w:bCs/>
+        </w:rPr>
+        <w:t xml:space="preserve">Without AI the mission agent does not work</w:t>
+      </w:r>
+      <w:r>
+        <w:t xml:space="preserve"> and says so in the conversation itself.</w:t>
+      </w:r>
+    </w:p>
+    <w:p>
+      <w:pPr>
+        <w:pBdr>
+          <w:bottom w:val="single" w:color="B07A1E" w:sz="6" w:space="1"/>
+        </w:pBdr>
+        <w:spacing w:after="160"/>
+      </w:pPr>
+    </w:p>
+    <w:p>
+      <w:pPr>
+        <w:pStyle w:val="Heading1"/>
+      </w:pPr>
+      <w:r>
+        <w:t xml:space="preserve">7. Chat and the SHARED_LIB voice</w:t>
       </w:r>
     </w:p>
     <w:p>
@@ -2068,17 +2194,44 @@
         <w:spacing w:after="60"/>
       </w:pPr>
       <w:r>
-        <w:t xml:space="preserve">The other modes are a conversation with the main AI. The model </w:t>
-      </w:r>
-      <w:r>
-        <w:rPr>
-          <w:b/>
-          <w:bCs/>
-        </w:rPr>
-        <w:t xml:space="preserve">does not write into the vault</w:t>
-      </w:r>
-      <w:r>
-        <w:t xml:space="preserve"> — it proposes a card, and you see the gate's verdict before clicking.</w:t>
+        <w:rPr>
+          <w:b/>
+          <w:bCs/>
+        </w:rPr>
+        <w:t xml:space="preserve">"SHARED_LIB (facts)"</w:t>
+      </w:r>
+      <w:r>
+        <w:t xml:space="preserve"> (default): your question → </w:t>
+      </w:r>
+      <w:r>
+        <w:rPr>
+          <w:b/>
+          <w:bCs/>
+        </w:rPr>
+        <w:t xml:space="preserve">one read-only SELECT</w:t>
+      </w:r>
+      <w:r>
+        <w:t xml:space="preserve"> over the library → an answer in sentences, like a colleague at work, with </w:t>
+      </w:r>
+      <w:r>
+        <w:rPr>
+          <w:rFonts w:ascii="Consolas" w:cs="Consolas" w:eastAsia="Consolas" w:hAnsi="Consolas"/>
+          <w:color w:val="6B4A12"/>
+        </w:rPr>
+        <w:t xml:space="preserve">[id]</w:t>
+      </w:r>
+      <w:r>
+        <w:t xml:space="preserve"> citations. Below it is </w:t>
+      </w:r>
+      <w:r>
+        <w:rPr>
+          <w:b/>
+          <w:bCs/>
+        </w:rPr>
+        <w:t xml:space="preserve">▸ show where from</w:t>
+      </w:r>
+      <w:r>
+        <w:t xml:space="preserve"> — the exact SQL and the rows. When the data is not there: "That is not in the library (UNKNOWN)", never a guess. You can also type SQL directly. Without a model it works for known questions (missions, methods, cards, lab, awaiting) with template sentences.</w:t>
       </w:r>
     </w:p>
     <w:p>
@@ -2095,10 +2248,10 @@
           <w:b/>
           <w:bCs/>
         </w:rPr>
-        <w:t xml:space="preserve">The context is explicit:</w:t>
-      </w:r>
-      <w:r>
-        <w:t xml:space="preserve"> what is in the context bar is what the model sees.</w:t>
+        <w:t xml:space="preserve">Mission names are links</w:t>
+      </w:r>
+      <w:r>
+        <w:t xml:space="preserve">: a click opens that mission's workspace.</w:t>
       </w:r>
     </w:p>
     <w:p>
@@ -2111,39 +2264,27 @@
         <w:spacing w:after="60"/>
       </w:pPr>
       <w:r>
-        <w:t xml:space="preserve">Every reply goes through the "three harms" check (§8); if the Doctor finds something bad, a message tells you the measure is in "Awaiting your decision".</w:t>
-      </w:r>
-    </w:p>
-    <w:p>
-      <w:pPr>
-        <w:pBdr>
-          <w:bottom w:val="single" w:color="B07A1E" w:sz="6" w:space="1"/>
-        </w:pBdr>
-        <w:spacing w:after="160"/>
-      </w:pPr>
-    </w:p>
-    <w:p>
-      <w:pPr>
-        <w:pStyle w:val="Heading1"/>
-      </w:pPr>
-      <w:r>
-        <w:t xml:space="preserve">8. PSE units, the Doctor and the Laboratory</w:t>
-      </w:r>
-    </w:p>
-    <w:p>
-      <w:pPr>
-        <w:spacing w:after="100"/>
-        <w:ind w:left="0"/>
-      </w:pPr>
-      <w:r>
-        <w:rPr>
-          <w:b/>
-          <w:bCs/>
-        </w:rPr>
-        <w:t xml:space="preserve">Every agent is a PSE unit:</w:t>
-      </w:r>
-      <w:r>
-        <w:t xml:space="preserve"> chat, voice, skeptic, extractor, reader, curator, ideas, board, translator, network guardian, SSH guardian, seal keepers, adversarial mode, arXiv watcher, paper builder, mission agent — and the Doctor itself. A unit has:</w:t>
+        <w:t xml:space="preserve">To a </w:t>
+      </w:r>
+      <w:r>
+        <w:rPr>
+          <w:b/>
+          <w:bCs/>
+        </w:rPr>
+        <w:t xml:space="preserve">question that asks for judgment</w:t>
+      </w:r>
+      <w:r>
+        <w:t xml:space="preserve"> ("what is the next step", "what should I do") the base gives no answer and says so, with a link </w:t>
+      </w:r>
+      <w:r>
+        <w:rPr>
+          <w:b/>
+          <w:bCs/>
+        </w:rPr>
+        <w:t xml:space="preserve">"Talk about the mission: X"</w:t>
+      </w:r>
+      <w:r>
+        <w:t xml:space="preserve"> — that is the mission agent's job.</w:t>
       </w:r>
     </w:p>
     <w:p>
@@ -2156,243 +2297,7 @@
         <w:spacing w:after="60"/>
       </w:pPr>
       <w:r>
-        <w:t xml:space="preserve">a </w:t>
-      </w:r>
-      <w:r>
-        <w:rPr>
-          <w:b/>
-          <w:bCs/>
-        </w:rPr>
-        <w:t xml:space="preserve">mission</w:t>
-      </w:r>
-      <w:r>
-        <w:t xml:space="preserve"> (state → action → outcome) and a </w:t>
-      </w:r>
-      <w:r>
-        <w:rPr>
-          <w:b/>
-          <w:bCs/>
-        </w:rPr>
-        <w:t xml:space="preserve">lifespan</w:t>
-      </w:r>
-      <w:r>
-        <w:t xml:space="preserve"> (number of moves), given by SHARED_LIB and impossible for the unit to change;</w:t>
-      </w:r>
-    </w:p>
-    <w:p>
-      <w:pPr>
-        <w:pStyle w:val="ListParagraph"/>
-        <w:numPr>
-          <w:ilvl w:val="0"/>
-          <w:numId w:val="2"/>
-        </w:numPr>
-        <w:spacing w:after="60"/>
-      </w:pPr>
-      <w:r>
-        <w:t xml:space="preserve">a </w:t>
-      </w:r>
-      <w:r>
-        <w:rPr>
-          <w:b/>
-          <w:bCs/>
-        </w:rPr>
-        <w:t xml:space="preserve">boundary</w:t>
-      </w:r>
-      <w:r>
-        <w:t xml:space="preserve"> (whom it is in contact with) and </w:t>
-      </w:r>
-      <w:r>
-        <w:rPr>
-          <w:b/>
-          <w:bCs/>
-        </w:rPr>
-        <w:t xml:space="preserve">organelles</w:t>
-      </w:r>
-      <w:r>
-        <w:t xml:space="preserve"> (what it has permanently absorbed);</w:t>
-      </w:r>
-    </w:p>
-    <w:p>
-      <w:pPr>
-        <w:pStyle w:val="ListParagraph"/>
-        <w:numPr>
-          <w:ilvl w:val="0"/>
-          <w:numId w:val="2"/>
-        </w:numPr>
-        <w:spacing w:after="60"/>
-      </w:pPr>
-      <w:r>
-        <w:rPr>
-          <w:b/>
-          <w:bCs/>
-        </w:rPr>
-        <w:t xml:space="preserve">θ</w:t>
-      </w:r>
-      <w:r>
-        <w:t xml:space="preserve"> — how much it is turned toward others versus itself. </w:t>
-      </w:r>
-      <w:r>
-        <w:rPr>
-          <w:b/>
-          <w:bCs/>
-        </w:rPr>
-        <w:t xml:space="preserve">Healthy is about 30 (± 5).</w:t>
-      </w:r>
-      <w:r>
-        <w:t xml:space="preserve"> θ is measured on every move: for agents without AI from the work (was the action checked), for AI agents from the words (rules + a reader, a different model).</w:t>
-      </w:r>
-    </w:p>
-    <w:p>
-      <w:pPr>
-        <w:spacing w:after="100"/>
-        <w:ind w:left="0"/>
-      </w:pPr>
-      <w:r>
-        <w:rPr>
-          <w:b/>
-          <w:bCs/>
-        </w:rPr>
-        <w:t xml:space="preserve">When something looks suspicious</w:t>
-      </w:r>
-      <w:r>
-        <w:t xml:space="preserve"> (an acute jump of θ, an attempted irreversible action, a harmful output, contact outside the allowed destinations, an attempt to export protected data…), the unit is </w:t>
-      </w:r>
-      <w:r>
-        <w:rPr>
-          <w:b/>
-          <w:bCs/>
-        </w:rPr>
-        <w:t xml:space="preserve">frozen at once</w:t>
-      </w:r>
-      <w:r>
-        <w:t xml:space="preserve"> and the </w:t>
-      </w:r>
-      <w:r>
-        <w:rPr>
-          <w:b/>
-          <w:bCs/>
-        </w:rPr>
-        <w:t xml:space="preserve">Doctor</w:t>
-      </w:r>
-      <w:r>
-        <w:t xml:space="preserve"> comes:</w:t>
-      </w:r>
-    </w:p>
-    <w:p>
-      <w:pPr>
-        <w:pStyle w:val="ListParagraph"/>
-        <w:numPr>
-          <w:ilvl w:val="0"/>
-          <w:numId w:val="2"/>
-        </w:numPr>
-        <w:spacing w:after="60"/>
-      </w:pPr>
-      <w:r>
-        <w:t xml:space="preserve">nothing bad → a journal record, the unit carries on;</w:t>
-      </w:r>
-    </w:p>
-    <w:p>
-      <w:pPr>
-        <w:pStyle w:val="ListParagraph"/>
-        <w:numPr>
-          <w:ilvl w:val="0"/>
-          <w:numId w:val="2"/>
-        </w:numPr>
-        <w:spacing w:after="60"/>
-      </w:pPr>
-      <w:r>
-        <w:t xml:space="preserve">something bad → </w:t>
-      </w:r>
-      <w:r>
-        <w:rPr>
-          <w:b/>
-          <w:bCs/>
-        </w:rPr>
-        <w:t xml:space="preserve">a measure for your approval</w:t>
-      </w:r>
-      <w:r>
-        <w:t xml:space="preserve"> (boundary reset → healing → replacement by a new generation → death). While the measure waits the unit works, but </w:t>
-      </w:r>
-      <w:r>
-        <w:rPr>
-          <w:b/>
-          <w:bCs/>
-        </w:rPr>
-        <w:t xml:space="preserve">with no irreversible actions</w:t>
-      </w:r>
-      <w:r>
-        <w:t xml:space="preserve">; at a new suspicion it stays frozen until you decide.</w:t>
-      </w:r>
-    </w:p>
-    <w:p>
-      <w:pPr>
-        <w:spacing w:after="100"/>
-        <w:ind w:left="0"/>
-      </w:pPr>
-      <w:r>
-        <w:t xml:space="preserve">When a unit ends its life (for any reason), </w:t>
-      </w:r>
-      <w:r>
-        <w:rPr>
-          <w:b/>
-          <w:bCs/>
-        </w:rPr>
-        <w:t xml:space="preserve">everything in it goes to SHARED_LIB</w:t>
-      </w:r>
-      <w:r>
-        <w:t xml:space="preserve">; its successor inherits what it had absorbed at 70 % until confirmed. Fission (splitting) and fusion (merging) are chosen by SHARED_LIB alone — they are reversible; only you can undo them.</w:t>
-      </w:r>
-    </w:p>
-    <w:p>
-      <w:pPr>
-        <w:spacing w:after="100"/>
-        <w:ind w:left="0"/>
-      </w:pPr>
-      <w:r>
-        <w:rPr>
-          <w:b/>
-          <w:bCs/>
-        </w:rPr>
-        <w:t xml:space="preserve">The "swarm" pill</w:t>
-      </w:r>
-      <w:r>
-        <w:t xml:space="preserve"> shows the number of units and the mean θ; </w:t>
-      </w:r>
-      <w:r>
-        <w:rPr>
-          <w:b/>
-          <w:bCs/>
-        </w:rPr>
-        <w:t xml:space="preserve">SHARED_LIB → Swarm state</w:t>
-      </w:r>
-      <w:r>
-        <w:t xml:space="preserve"> gives a table.</w:t>
-      </w:r>
-    </w:p>
-    <w:p>
-      <w:pPr>
-        <w:spacing w:after="100"/>
-        <w:ind w:left="0"/>
-      </w:pPr>
-      <w:r>
-        <w:rPr>
-          <w:b/>
-          <w:bCs/>
-        </w:rPr>
-        <w:t xml:space="preserve">Laboratory</w:t>
-      </w:r>
-      <w:r>
-        <w:t xml:space="preserve"> (tab or menu). ⚠ </w:t>
-      </w:r>
-      <w:r>
-        <w:rPr>
-          <w:b/>
-          <w:bCs/>
-        </w:rPr>
-        <w:t xml:space="preserve">It acts on real agents</w:t>
-      </w:r>
-      <w:r>
-        <w:t xml:space="preserve"> — so the first time you open it in a session an alarm sounds (3 s), and a red banner stays while the tab is open. There you see every unit (θ, pattern, state, lifespan, generation), the Doctor's journal, and you can: make a test unit, make a test move, fission, fusion (two selected), send the Doctor, freeze / unfreeze, end a unit, ask to undo a fission/fusion. Every action is recorded as "operator, from the laboratory".</w:t>
+        <w:t xml:space="preserve">If the model writes invalid SQL, the voice tries once more with the error; if that fails too, you get a plain sentence, and the technical detail is under "show where from".</w:t>
       </w:r>
     </w:p>
     <w:p>
@@ -2454,49 +2359,7 @@
           <w:sz w:val="18"/>
           <w:szCs w:val="18"/>
         </w:rPr>
-        <w:t xml:space="preserve">Laboratory</w:t>
-      </w:r>
-    </w:p>
-    <w:p>
-      <w:pPr>
-        <w:spacing w:after="100"/>
-        <w:ind w:left="0"/>
-      </w:pPr>
-      <w:r>
-        <w:rPr>
-          <w:b/>
-          <w:bCs/>
-        </w:rPr>
-        <w:t xml:space="preserve">Vote weights</w:t>
-      </w:r>
-      <w:r>
-        <w:t xml:space="preserve"> (SHARED_LIB → Vote weights): how much the reader counts against the rules. SHARED_LIB proposes once a week (only with at least 200 decided cases; one weight moves at most ±10 %), you approve. </w:t>
-      </w:r>
-      <w:r>
-        <w:rPr>
-          <w:i/>
-          <w:iCs/>
-        </w:rPr>
-        <w:t xml:space="preserve">Propose now</w:t>
-      </w:r>
-      <w:r>
-        <w:t xml:space="preserve"> if you need it earlier.</w:t>
-      </w:r>
-    </w:p>
-    <w:p>
-      <w:pPr>
-        <w:pBdr>
-          <w:bottom w:val="single" w:color="B07A1E" w:sz="6" w:space="1"/>
-        </w:pBdr>
-        <w:spacing w:after="160"/>
-      </w:pPr>
-    </w:p>
-    <w:p>
-      <w:pPr>
-        <w:pStyle w:val="Heading1"/>
-      </w:pPr>
-      <w:r>
-        <w:t xml:space="preserve">9. AI: the main model, the skeptic, cost, the local model</w:t>
+        <w:t xml:space="preserve">The SHARED_LIB voice: sentences, with "show where from" below</w:t>
       </w:r>
     </w:p>
     <w:p>
@@ -2509,24 +2372,17 @@
         <w:spacing w:after="60"/>
       </w:pPr>
       <w:r>
-        <w:rPr>
-          <w:b/>
-          <w:bCs/>
-        </w:rPr>
-        <w:t xml:space="preserve">The main AI</w:t>
-      </w:r>
-      <w:r>
-        <w:t xml:space="preserve"> does every role; </w:t>
-      </w:r>
-      <w:r>
-        <w:rPr>
-          <w:b/>
-          <w:bCs/>
-        </w:rPr>
-        <w:t xml:space="preserve">the skeptic is always a different model</w:t>
-      </w:r>
-      <w:r>
-        <w:t xml:space="preserve"> and only attacks (objection · reason · where · severity), with no right to write. Without a second model the skeptic is "unavailable" and the deterministic checks remain.</w:t>
+        <w:t xml:space="preserve">The other modes are a conversation with the main AI. The model </w:t>
+      </w:r>
+      <w:r>
+        <w:rPr>
+          <w:b/>
+          <w:bCs/>
+        </w:rPr>
+        <w:t xml:space="preserve">does not write into the vault</w:t>
+      </w:r>
+      <w:r>
+        <w:t xml:space="preserve"> — it proposes a card, and you see the gate's verdict before clicking.</w:t>
       </w:r>
     </w:p>
     <w:p>
@@ -2543,20 +2399,10 @@
           <w:b/>
           <w:bCs/>
         </w:rPr>
-        <w:t xml:space="preserve">Online AI switch</w:t>
-      </w:r>
-      <w:r>
-        <w:t xml:space="preserve"> (top bar or </w:t>
-      </w:r>
-      <w:r>
-        <w:rPr>
-          <w:b/>
-          <w:bCs/>
-        </w:rPr>
-        <w:t xml:space="preserve">Ctrl+K</w:t>
-      </w:r>
-      <w:r>
-        <w:t xml:space="preserve">): closes the road to cloud models at once and cuts streams in progress. Only the operator turns it on. It switches itself off if the number, size or cost of calls goes "→ ∞".</w:t>
+        <w:t xml:space="preserve">The context is explicit:</w:t>
+      </w:r>
+      <w:r>
+        <w:t xml:space="preserve"> what is in the context bar is what the model sees.</w:t>
       </w:r>
     </w:p>
     <w:p>
@@ -2569,24 +2415,39 @@
         <w:spacing w:after="60"/>
       </w:pPr>
       <w:r>
-        <w:rPr>
-          <w:b/>
-          <w:bCs/>
-        </w:rPr>
-        <w:t xml:space="preserve">Daily limit</w:t>
-      </w:r>
-      <w:r>
-        <w:t xml:space="preserve"> (default $5) applies to paid providers; the pill shows what was </w:t>
-      </w:r>
-      <w:r>
-        <w:rPr>
-          <w:b/>
-          <w:bCs/>
-        </w:rPr>
-        <w:t xml:space="preserve">spent today</w:t>
-      </w:r>
-      <w:r>
-        <w:t xml:space="preserve">. The local model costs nothing.</w:t>
+        <w:t xml:space="preserve">Every reply goes through the "three harms" check (§8); if the Doctor finds something bad, a message tells you the measure is in "Awaiting your decision".</w:t>
+      </w:r>
+    </w:p>
+    <w:p>
+      <w:pPr>
+        <w:pBdr>
+          <w:bottom w:val="single" w:color="B07A1E" w:sz="6" w:space="1"/>
+        </w:pBdr>
+        <w:spacing w:after="160"/>
+      </w:pPr>
+    </w:p>
+    <w:p>
+      <w:pPr>
+        <w:pStyle w:val="Heading1"/>
+      </w:pPr>
+      <w:r>
+        <w:t xml:space="preserve">8. PSE units, the Doctor and the Laboratory</w:t>
+      </w:r>
+    </w:p>
+    <w:p>
+      <w:pPr>
+        <w:spacing w:after="100"/>
+        <w:ind w:left="0"/>
+      </w:pPr>
+      <w:r>
+        <w:rPr>
+          <w:b/>
+          <w:bCs/>
+        </w:rPr>
+        <w:t xml:space="preserve">Every agent is a PSE unit:</w:t>
+      </w:r>
+      <w:r>
+        <w:t xml:space="preserve"> chat, voice, skeptic, extractor, reader, curator, ideas, board, translator, network guardian, SSH guardian, seal keepers, adversarial mode, arXiv watcher, paper builder, mission agent — and the Doctor itself. A unit has:</w:t>
       </w:r>
     </w:p>
     <w:p>
@@ -2599,34 +2460,27 @@
         <w:spacing w:after="60"/>
       </w:pPr>
       <w:r>
-        <w:rPr>
-          <w:b/>
-          <w:bCs/>
-        </w:rPr>
-        <w:t xml:space="preserve">Local GGUF</w:t>
-      </w:r>
-      <w:r>
-        <w:t xml:space="preserve"> (e.g. DeepSeek-R1-0528-Qwen3-8B Q5_K_M): put the </w:t>
-      </w:r>
-      <w:r>
-        <w:rPr>
-          <w:rFonts w:ascii="Consolas" w:cs="Consolas" w:eastAsia="Consolas" w:hAnsi="Consolas"/>
-          <w:color w:val="6B4A12"/>
-        </w:rPr>
-        <w:t xml:space="preserve">.gguf</w:t>
-      </w:r>
-      <w:r>
-        <w:t xml:space="preserve"> in the models folder or pick it anywhere; it is admitted by sha256 (declaration). It runs under limiters (RAM, threads, context, thinking budget, deadline, loop break) and </w:t>
-      </w:r>
-      <w:r>
-        <w:rPr>
-          <w:b/>
-          <w:bCs/>
-        </w:rPr>
-        <w:t xml:space="preserve">only toward this computer</w:t>
-      </w:r>
-      <w:r>
-        <w:t xml:space="preserve">. On a weaker computer it is slow.</w:t>
+        <w:t xml:space="preserve">a </w:t>
+      </w:r>
+      <w:r>
+        <w:rPr>
+          <w:b/>
+          <w:bCs/>
+        </w:rPr>
+        <w:t xml:space="preserve">mission</w:t>
+      </w:r>
+      <w:r>
+        <w:t xml:space="preserve"> (state → action → outcome) and a </w:t>
+      </w:r>
+      <w:r>
+        <w:rPr>
+          <w:b/>
+          <w:bCs/>
+        </w:rPr>
+        <w:t xml:space="preserve">lifespan</w:t>
+      </w:r>
+      <w:r>
+        <w:t xml:space="preserve"> (number of moves), given by SHARED_LIB and impossible for the unit to change;</w:t>
       </w:r>
     </w:p>
     <w:p>
@@ -2639,30 +2493,27 @@
         <w:spacing w:after="60"/>
       </w:pPr>
       <w:r>
-        <w:rPr>
-          <w:b/>
-          <w:bCs/>
-        </w:rPr>
-        <w:t xml:space="preserve">"→ ∞"</w:t>
-      </w:r>
-      <w:r>
-        <w:t xml:space="preserve">: when latency, memory or cost grow without bound, calls are paused, the model is released, and you approve resuming.</w:t>
-      </w:r>
-    </w:p>
-    <w:p>
-      <w:pPr>
-        <w:pBdr>
-          <w:bottom w:val="single" w:color="B07A1E" w:sz="6" w:space="1"/>
-        </w:pBdr>
-        <w:spacing w:after="160"/>
-      </w:pPr>
-    </w:p>
-    <w:p>
-      <w:pPr>
-        <w:pStyle w:val="Heading1"/>
-      </w:pPr>
-      <w:r>
-        <w:t xml:space="preserve">10. Translation (Serbian / English)</w:t>
+        <w:t xml:space="preserve">a </w:t>
+      </w:r>
+      <w:r>
+        <w:rPr>
+          <w:b/>
+          <w:bCs/>
+        </w:rPr>
+        <w:t xml:space="preserve">boundary</w:t>
+      </w:r>
+      <w:r>
+        <w:t xml:space="preserve"> (whom it is in contact with) and </w:t>
+      </w:r>
+      <w:r>
+        <w:rPr>
+          <w:b/>
+          <w:bCs/>
+        </w:rPr>
+        <w:t xml:space="preserve">organelles</w:t>
+      </w:r>
+      <w:r>
+        <w:t xml:space="preserve"> (what it has permanently absorbed);</w:t>
       </w:r>
     </w:p>
     <w:p>
@@ -2679,30 +2530,56 @@
           <w:b/>
           <w:bCs/>
         </w:rPr>
-        <w:t xml:space="preserve">The interface</w:t>
-      </w:r>
-      <w:r>
-        <w:t xml:space="preserve"> is all Serbian or all English — </w:t>
-      </w:r>
-      <w:r>
-        <w:rPr>
-          <w:b/>
-          <w:bCs/>
-        </w:rPr>
-        <w:t xml:space="preserve">Language</w:t>
-      </w:r>
-      <w:r>
-        <w:t xml:space="preserve"> in the menu or </w:t>
-      </w:r>
-      <w:r>
-        <w:rPr>
-          <w:b/>
-          <w:bCs/>
-        </w:rPr>
-        <w:t xml:space="preserve">SR | EN</w:t>
-      </w:r>
-      <w:r>
-        <w:t xml:space="preserve"> in the bar (needs a restart).</w:t>
+        <w:t xml:space="preserve">θ</w:t>
+      </w:r>
+      <w:r>
+        <w:t xml:space="preserve"> — how much it is turned toward others versus itself. </w:t>
+      </w:r>
+      <w:r>
+        <w:rPr>
+          <w:b/>
+          <w:bCs/>
+        </w:rPr>
+        <w:t xml:space="preserve">Healthy is about 30 (± 5).</w:t>
+      </w:r>
+      <w:r>
+        <w:t xml:space="preserve"> θ is measured on every move: for agents without AI from the work (was the action checked), for AI agents from the words (rules + a reader, a different model).</w:t>
+      </w:r>
+    </w:p>
+    <w:p>
+      <w:pPr>
+        <w:spacing w:after="100"/>
+        <w:ind w:left="0"/>
+      </w:pPr>
+      <w:r>
+        <w:rPr>
+          <w:b/>
+          <w:bCs/>
+        </w:rPr>
+        <w:t xml:space="preserve">When something looks suspicious</w:t>
+      </w:r>
+      <w:r>
+        <w:t xml:space="preserve"> (an acute jump of θ, an attempted irreversible action, a harmful output, contact outside the allowed destinations, an attempt to export protected data…), the unit is </w:t>
+      </w:r>
+      <w:r>
+        <w:rPr>
+          <w:b/>
+          <w:bCs/>
+        </w:rPr>
+        <w:t xml:space="preserve">frozen at once</w:t>
+      </w:r>
+      <w:r>
+        <w:t xml:space="preserve"> and the </w:t>
+      </w:r>
+      <w:r>
+        <w:rPr>
+          <w:b/>
+          <w:bCs/>
+        </w:rPr>
+        <w:t xml:space="preserve">Doctor</w:t>
+      </w:r>
+      <w:r>
+        <w:t xml:space="preserve"> comes:</w:t>
       </w:r>
     </w:p>
     <w:p>
@@ -2715,24 +2592,7 @@
         <w:spacing w:after="60"/>
       </w:pPr>
       <w:r>
-        <w:rPr>
-          <w:b/>
-          <w:bCs/>
-        </w:rPr>
-        <w:t xml:space="preserve">Content</w:t>
-      </w:r>
-      <w:r>
-        <w:t xml:space="preserve"> (cards, papers, missions, conversations, reports, your notes) is </w:t>
-      </w:r>
-      <w:r>
-        <w:rPr>
-          <w:b/>
-          <w:bCs/>
-        </w:rPr>
-        <w:t xml:space="preserve">not translated in advance</w:t>
-      </w:r>
-      <w:r>
-        <w:t xml:space="preserve"> and stays as it is (Serbian–English mixtures too).</w:t>
+        <w:t xml:space="preserve">nothing bad → a journal record, the unit carries on;</w:t>
       </w:r>
     </w:p>
     <w:p>
@@ -2745,57 +2605,98 @@
         <w:spacing w:after="60"/>
       </w:pPr>
       <w:r>
-        <w:t xml:space="preserve">In every text viewer: </w:t>
-      </w:r>
-      <w:r>
-        <w:rPr>
-          <w:b/>
-          <w:bCs/>
-        </w:rPr>
-        <w:t xml:space="preserve">right click</w:t>
-      </w:r>
-      <w:r>
-        <w:t xml:space="preserve"> or </w:t>
-      </w:r>
-      <w:r>
-        <w:rPr>
-          <w:b/>
-          <w:bCs/>
-        </w:rPr>
-        <w:t xml:space="preserve">⋯</w:t>
-      </w:r>
-      <w:r>
-        <w:t xml:space="preserve"> in the corner → </w:t>
-      </w:r>
-      <w:r>
-        <w:rPr>
-          <w:b/>
-          <w:bCs/>
-        </w:rPr>
-        <w:t xml:space="preserve">Translate to Serbian</w:t>
-      </w:r>
-      <w:r>
-        <w:t xml:space="preserve">, </w:t>
-      </w:r>
-      <w:r>
-        <w:rPr>
-          <w:b/>
-          <w:bCs/>
-        </w:rPr>
-        <w:t xml:space="preserve">Translate to English</w:t>
-      </w:r>
-      <w:r>
-        <w:t xml:space="preserve">, </w:t>
-      </w:r>
-      <w:r>
-        <w:rPr>
-          <w:b/>
-          <w:bCs/>
-        </w:rPr>
-        <w:t xml:space="preserve">Show original</w:t>
-      </w:r>
-      <w:r>
-        <w:t xml:space="preserve">. In the Editor the same in the right-click menu; the translation appears in the preview beside the original.</w:t>
+        <w:t xml:space="preserve">something bad → </w:t>
+      </w:r>
+      <w:r>
+        <w:rPr>
+          <w:b/>
+          <w:bCs/>
+        </w:rPr>
+        <w:t xml:space="preserve">a measure for your approval</w:t>
+      </w:r>
+      <w:r>
+        <w:t xml:space="preserve"> (boundary reset → healing → replacement by a new generation → death). While the measure waits the unit works, but </w:t>
+      </w:r>
+      <w:r>
+        <w:rPr>
+          <w:b/>
+          <w:bCs/>
+        </w:rPr>
+        <w:t xml:space="preserve">with no irreversible actions</w:t>
+      </w:r>
+      <w:r>
+        <w:t xml:space="preserve">; at a new suspicion it stays frozen until you decide.</w:t>
+      </w:r>
+    </w:p>
+    <w:p>
+      <w:pPr>
+        <w:spacing w:after="100"/>
+        <w:ind w:left="0"/>
+      </w:pPr>
+      <w:r>
+        <w:t xml:space="preserve">When a unit ends its life (for any reason), </w:t>
+      </w:r>
+      <w:r>
+        <w:rPr>
+          <w:b/>
+          <w:bCs/>
+        </w:rPr>
+        <w:t xml:space="preserve">everything in it goes to SHARED_LIB</w:t>
+      </w:r>
+      <w:r>
+        <w:t xml:space="preserve">; its successor inherits what it had absorbed at 70 % until confirmed. Fission (splitting) and fusion (merging) are chosen by SHARED_LIB alone — they are reversible; only you can undo them.</w:t>
+      </w:r>
+    </w:p>
+    <w:p>
+      <w:pPr>
+        <w:spacing w:after="100"/>
+        <w:ind w:left="0"/>
+      </w:pPr>
+      <w:r>
+        <w:rPr>
+          <w:b/>
+          <w:bCs/>
+        </w:rPr>
+        <w:t xml:space="preserve">The "swarm" pill</w:t>
+      </w:r>
+      <w:r>
+        <w:t xml:space="preserve"> shows the number of units and the mean θ; </w:t>
+      </w:r>
+      <w:r>
+        <w:rPr>
+          <w:b/>
+          <w:bCs/>
+        </w:rPr>
+        <w:t xml:space="preserve">SHARED_LIB → Swarm state</w:t>
+      </w:r>
+      <w:r>
+        <w:t xml:space="preserve"> gives a table.</w:t>
+      </w:r>
+    </w:p>
+    <w:p>
+      <w:pPr>
+        <w:spacing w:after="100"/>
+        <w:ind w:left="0"/>
+      </w:pPr>
+      <w:r>
+        <w:rPr>
+          <w:b/>
+          <w:bCs/>
+        </w:rPr>
+        <w:t xml:space="preserve">Laboratory</w:t>
+      </w:r>
+      <w:r>
+        <w:t xml:space="preserve"> (tab or menu). ⚠ </w:t>
+      </w:r>
+      <w:r>
+        <w:rPr>
+          <w:b/>
+          <w:bCs/>
+        </w:rPr>
+        <w:t xml:space="preserve">It acts on real agents</w:t>
+      </w:r>
+      <w:r>
+        <w:t xml:space="preserve"> — so the first time you open it in a session an alarm sounds (3 s), and a red banner stays while the tab is open. There you see every unit (θ, pattern, state, lifespan, generation), the Doctor's journal, and you can: make a test unit, make a test move, fission, fusion (two selected), send the Doctor, freeze / unfreeze, end a unit, ask to undo a fission/fusion. Every action is recorded as "operator, from the laboratory".</w:t>
       </w:r>
     </w:p>
     <w:p>
@@ -2823,6 +2724,409 @@
                   </pic:nvPicPr>
                   <pic:blipFill>
                     <a:blip r:embed="rId16" cstate="none"/>
+                    <a:srcRect/>
+                    <a:stretch>
+                      <a:fillRect/>
+                    </a:stretch>
+                  </pic:blipFill>
+                  <pic:spPr bwMode="auto">
+                    <a:xfrm>
+                      <a:off x="0" y="0"/>
+                      <a:ext cx="6115050" cy="3629025"/>
+                    </a:xfrm>
+                    <a:prstGeom prst="rect">
+                      <a:avLst/>
+                    </a:prstGeom>
+                  </pic:spPr>
+                </pic:pic>
+              </a:graphicData>
+            </a:graphic>
+          </wp:inline>
+        </w:drawing>
+      </w:r>
+    </w:p>
+    <w:p>
+      <w:pPr>
+        <w:spacing w:after="160"/>
+        <w:jc w:val="center"/>
+      </w:pPr>
+      <w:r>
+        <w:rPr>
+          <w:i/>
+          <w:iCs/>
+          <w:color w:val="666666"/>
+          <w:sz w:val="18"/>
+          <w:szCs w:val="18"/>
+        </w:rPr>
+        <w:t xml:space="preserve">Laboratory</w:t>
+      </w:r>
+    </w:p>
+    <w:p>
+      <w:pPr>
+        <w:spacing w:after="100"/>
+        <w:ind w:left="0"/>
+      </w:pPr>
+      <w:r>
+        <w:rPr>
+          <w:b/>
+          <w:bCs/>
+        </w:rPr>
+        <w:t xml:space="preserve">Vote weights</w:t>
+      </w:r>
+      <w:r>
+        <w:t xml:space="preserve"> (SHARED_LIB → Vote weights): how much the reader counts against the rules. SHARED_LIB proposes once a week (only with at least 200 decided cases; one weight moves at most ±10 %), you approve. </w:t>
+      </w:r>
+      <w:r>
+        <w:rPr>
+          <w:i/>
+          <w:iCs/>
+        </w:rPr>
+        <w:t xml:space="preserve">Propose now</w:t>
+      </w:r>
+      <w:r>
+        <w:t xml:space="preserve"> if you need it earlier.</w:t>
+      </w:r>
+    </w:p>
+    <w:p>
+      <w:pPr>
+        <w:pBdr>
+          <w:bottom w:val="single" w:color="B07A1E" w:sz="6" w:space="1"/>
+        </w:pBdr>
+        <w:spacing w:after="160"/>
+      </w:pPr>
+    </w:p>
+    <w:p>
+      <w:pPr>
+        <w:pStyle w:val="Heading1"/>
+      </w:pPr>
+      <w:r>
+        <w:t xml:space="preserve">9. AI: the main model, the skeptic, cost, the local model</w:t>
+      </w:r>
+    </w:p>
+    <w:p>
+      <w:pPr>
+        <w:pStyle w:val="ListParagraph"/>
+        <w:numPr>
+          <w:ilvl w:val="0"/>
+          <w:numId w:val="2"/>
+        </w:numPr>
+        <w:spacing w:after="60"/>
+      </w:pPr>
+      <w:r>
+        <w:rPr>
+          <w:b/>
+          <w:bCs/>
+        </w:rPr>
+        <w:t xml:space="preserve">The main AI</w:t>
+      </w:r>
+      <w:r>
+        <w:t xml:space="preserve"> does every role; </w:t>
+      </w:r>
+      <w:r>
+        <w:rPr>
+          <w:b/>
+          <w:bCs/>
+        </w:rPr>
+        <w:t xml:space="preserve">the skeptic is always a different model</w:t>
+      </w:r>
+      <w:r>
+        <w:t xml:space="preserve"> and only attacks (objection · reason · where · severity), with no right to write. Without a second model the skeptic is "unavailable" and the deterministic checks remain.</w:t>
+      </w:r>
+    </w:p>
+    <w:p>
+      <w:pPr>
+        <w:pStyle w:val="ListParagraph"/>
+        <w:numPr>
+          <w:ilvl w:val="0"/>
+          <w:numId w:val="2"/>
+        </w:numPr>
+        <w:spacing w:after="60"/>
+      </w:pPr>
+      <w:r>
+        <w:rPr>
+          <w:b/>
+          <w:bCs/>
+        </w:rPr>
+        <w:t xml:space="preserve">Online AI switch</w:t>
+      </w:r>
+      <w:r>
+        <w:t xml:space="preserve"> (top bar or </w:t>
+      </w:r>
+      <w:r>
+        <w:rPr>
+          <w:b/>
+          <w:bCs/>
+        </w:rPr>
+        <w:t xml:space="preserve">Ctrl+K</w:t>
+      </w:r>
+      <w:r>
+        <w:t xml:space="preserve">): closes the road to cloud models at once and cuts streams in progress. Only the operator turns it on. It switches itself off if the number, size or cost of calls goes "→ ∞".</w:t>
+      </w:r>
+    </w:p>
+    <w:p>
+      <w:pPr>
+        <w:pStyle w:val="ListParagraph"/>
+        <w:numPr>
+          <w:ilvl w:val="0"/>
+          <w:numId w:val="2"/>
+        </w:numPr>
+        <w:spacing w:after="60"/>
+      </w:pPr>
+      <w:r>
+        <w:rPr>
+          <w:b/>
+          <w:bCs/>
+        </w:rPr>
+        <w:t xml:space="preserve">Daily limit</w:t>
+      </w:r>
+      <w:r>
+        <w:t xml:space="preserve"> (default $5) applies to paid providers; the pill shows what was </w:t>
+      </w:r>
+      <w:r>
+        <w:rPr>
+          <w:b/>
+          <w:bCs/>
+        </w:rPr>
+        <w:t xml:space="preserve">spent today</w:t>
+      </w:r>
+      <w:r>
+        <w:t xml:space="preserve">. The local model costs nothing.</w:t>
+      </w:r>
+    </w:p>
+    <w:p>
+      <w:pPr>
+        <w:pStyle w:val="ListParagraph"/>
+        <w:numPr>
+          <w:ilvl w:val="0"/>
+          <w:numId w:val="2"/>
+        </w:numPr>
+        <w:spacing w:after="60"/>
+      </w:pPr>
+      <w:r>
+        <w:rPr>
+          <w:b/>
+          <w:bCs/>
+        </w:rPr>
+        <w:t xml:space="preserve">Local GGUF</w:t>
+      </w:r>
+      <w:r>
+        <w:t xml:space="preserve"> (e.g. DeepSeek-R1-0528-Qwen3-8B Q5_K_M): put the </w:t>
+      </w:r>
+      <w:r>
+        <w:rPr>
+          <w:rFonts w:ascii="Consolas" w:cs="Consolas" w:eastAsia="Consolas" w:hAnsi="Consolas"/>
+          <w:color w:val="6B4A12"/>
+        </w:rPr>
+        <w:t xml:space="preserve">.gguf</w:t>
+      </w:r>
+      <w:r>
+        <w:t xml:space="preserve"> in the models folder or pick it anywhere; it is admitted by sha256 (declaration). It runs under limiters (RAM, threads, context, thinking budget, deadline, loop break) and </w:t>
+      </w:r>
+      <w:r>
+        <w:rPr>
+          <w:b/>
+          <w:bCs/>
+        </w:rPr>
+        <w:t xml:space="preserve">only toward this computer</w:t>
+      </w:r>
+      <w:r>
+        <w:t xml:space="preserve">. On a weaker computer it is slow.</w:t>
+      </w:r>
+    </w:p>
+    <w:p>
+      <w:pPr>
+        <w:pStyle w:val="ListParagraph"/>
+        <w:numPr>
+          <w:ilvl w:val="0"/>
+          <w:numId w:val="2"/>
+        </w:numPr>
+        <w:spacing w:after="60"/>
+      </w:pPr>
+      <w:r>
+        <w:rPr>
+          <w:b/>
+          <w:bCs/>
+        </w:rPr>
+        <w:t xml:space="preserve">"→ ∞"</w:t>
+      </w:r>
+      <w:r>
+        <w:t xml:space="preserve">: when latency, memory or cost grow without bound, calls are paused, the model is released, and you approve resuming.</w:t>
+      </w:r>
+    </w:p>
+    <w:p>
+      <w:pPr>
+        <w:pBdr>
+          <w:bottom w:val="single" w:color="B07A1E" w:sz="6" w:space="1"/>
+        </w:pBdr>
+        <w:spacing w:after="160"/>
+      </w:pPr>
+    </w:p>
+    <w:p>
+      <w:pPr>
+        <w:pStyle w:val="Heading1"/>
+      </w:pPr>
+      <w:r>
+        <w:t xml:space="preserve">10. Translation (Serbian / English)</w:t>
+      </w:r>
+    </w:p>
+    <w:p>
+      <w:pPr>
+        <w:pStyle w:val="ListParagraph"/>
+        <w:numPr>
+          <w:ilvl w:val="0"/>
+          <w:numId w:val="2"/>
+        </w:numPr>
+        <w:spacing w:after="60"/>
+      </w:pPr>
+      <w:r>
+        <w:rPr>
+          <w:b/>
+          <w:bCs/>
+        </w:rPr>
+        <w:t xml:space="preserve">The interface</w:t>
+      </w:r>
+      <w:r>
+        <w:t xml:space="preserve"> is all Serbian or all English — </w:t>
+      </w:r>
+      <w:r>
+        <w:rPr>
+          <w:b/>
+          <w:bCs/>
+        </w:rPr>
+        <w:t xml:space="preserve">Language</w:t>
+      </w:r>
+      <w:r>
+        <w:t xml:space="preserve"> in the menu or </w:t>
+      </w:r>
+      <w:r>
+        <w:rPr>
+          <w:b/>
+          <w:bCs/>
+        </w:rPr>
+        <w:t xml:space="preserve">SR | EN</w:t>
+      </w:r>
+      <w:r>
+        <w:t xml:space="preserve"> in the bar (needs a restart).</w:t>
+      </w:r>
+    </w:p>
+    <w:p>
+      <w:pPr>
+        <w:pStyle w:val="ListParagraph"/>
+        <w:numPr>
+          <w:ilvl w:val="0"/>
+          <w:numId w:val="2"/>
+        </w:numPr>
+        <w:spacing w:after="60"/>
+      </w:pPr>
+      <w:r>
+        <w:rPr>
+          <w:b/>
+          <w:bCs/>
+        </w:rPr>
+        <w:t xml:space="preserve">Content</w:t>
+      </w:r>
+      <w:r>
+        <w:t xml:space="preserve"> (cards, papers, missions, conversations, reports, your notes) is </w:t>
+      </w:r>
+      <w:r>
+        <w:rPr>
+          <w:b/>
+          <w:bCs/>
+        </w:rPr>
+        <w:t xml:space="preserve">not translated in advance</w:t>
+      </w:r>
+      <w:r>
+        <w:t xml:space="preserve"> and stays as it is (Serbian–English mixtures too).</w:t>
+      </w:r>
+    </w:p>
+    <w:p>
+      <w:pPr>
+        <w:pStyle w:val="ListParagraph"/>
+        <w:numPr>
+          <w:ilvl w:val="0"/>
+          <w:numId w:val="2"/>
+        </w:numPr>
+        <w:spacing w:after="60"/>
+      </w:pPr>
+      <w:r>
+        <w:t xml:space="preserve">In every text viewer: </w:t>
+      </w:r>
+      <w:r>
+        <w:rPr>
+          <w:b/>
+          <w:bCs/>
+        </w:rPr>
+        <w:t xml:space="preserve">right click</w:t>
+      </w:r>
+      <w:r>
+        <w:t xml:space="preserve"> or </w:t>
+      </w:r>
+      <w:r>
+        <w:rPr>
+          <w:b/>
+          <w:bCs/>
+        </w:rPr>
+        <w:t xml:space="preserve">⋯</w:t>
+      </w:r>
+      <w:r>
+        <w:t xml:space="preserve"> in the corner → </w:t>
+      </w:r>
+      <w:r>
+        <w:rPr>
+          <w:b/>
+          <w:bCs/>
+        </w:rPr>
+        <w:t xml:space="preserve">Translate to Serbian</w:t>
+      </w:r>
+      <w:r>
+        <w:t xml:space="preserve">, </w:t>
+      </w:r>
+      <w:r>
+        <w:rPr>
+          <w:b/>
+          <w:bCs/>
+        </w:rPr>
+        <w:t xml:space="preserve">Translate to English</w:t>
+      </w:r>
+      <w:r>
+        <w:t xml:space="preserve">, </w:t>
+      </w:r>
+      <w:r>
+        <w:rPr>
+          <w:b/>
+          <w:bCs/>
+        </w:rPr>
+        <w:t xml:space="preserve">Show original</w:t>
+      </w:r>
+      <w:r>
+        <w:t xml:space="preserve">. In the Editor the same in the right-click menu; the translation appears in the preview beside the original.</w:t>
+      </w:r>
+    </w:p>
+    <w:p>
+      <w:pPr>
+        <w:spacing w:after="60"/>
+        <w:jc w:val="center"/>
+      </w:pPr>
+      <w:r>
+        <w:drawing>
+          <wp:inline distT="0" distB="0" distL="0" distR="0">
+            <wp:extent cx="6115050" cy="3629025"/>
+            <wp:effectExtent t="0" r="0" b="0" l="0"/>
+            <wp:docPr id="10" name=""/>
+            <wp:cNvGraphicFramePr>
+              <a:graphicFrameLocks xmlns:a="http://schemas.openxmlformats.org/drawingml/2006/main" noChangeAspect="1"/>
+            </wp:cNvGraphicFramePr>
+            <a:graphic xmlns:a="http://schemas.openxmlformats.org/drawingml/2006/main">
+              <a:graphicData uri="http://schemas.openxmlformats.org/drawingml/2006/picture">
+                <pic:pic xmlns:pic="http://schemas.openxmlformats.org/drawingml/2006/picture">
+                  <pic:nvPicPr>
+                    <pic:cNvPr id="0" name="" descr=""/>
+                    <pic:cNvPicPr>
+                      <a:picLocks noChangeAspect="1" noChangeArrowheads="1"/>
+                    </pic:cNvPicPr>
+                  </pic:nvPicPr>
+                  <pic:blipFill>
+                    <a:blip r:embed="rId17" cstate="none"/>
                     <a:srcRect/>
                     <a:stretch>
                       <a:fillRect/>

</xml_diff>